<commit_message>
add mode of transportation
</commit_message>
<xml_diff>
--- a/electron/database/generate-document/templates/contract-review.docx
+++ b/electron/database/generate-document/templates/contract-review.docx
@@ -928,11 +928,39 @@
                 <w:rFonts w:ascii="Arial" w:hAnsi="Arial" w:cs="Arial"/>
               </w:rPr>
             </w:pPr>
+            <w:proofErr w:type="gramStart"/>
             <w:r>
               <w:rPr>
                 <w:rFonts w:ascii="Arial" w:hAnsi="Arial" w:cs="Arial"/>
               </w:rPr>
               <w:t>OTHERS</w:t>
+            </w:r>
+            <w:r>
+              <w:rPr>
+                <w:rFonts w:ascii="Arial" w:hAnsi="Arial" w:cs="Arial"/>
+              </w:rPr>
+              <w:t xml:space="preserve"> :</w:t>
+            </w:r>
+            <w:proofErr w:type="gramEnd"/>
+            <w:r>
+              <w:rPr>
+                <w:rFonts w:ascii="Arial" w:hAnsi="Arial" w:cs="Arial"/>
+              </w:rPr>
+              <w:t xml:space="preserve"> By {</w:t>
+            </w:r>
+            <w:proofErr w:type="spellStart"/>
+            <w:r>
+              <w:rPr>
+                <w:rFonts w:ascii="Arial" w:hAnsi="Arial" w:cs="Arial"/>
+              </w:rPr>
+              <w:t>transportationMode</w:t>
+            </w:r>
+            <w:proofErr w:type="spellEnd"/>
+            <w:r>
+              <w:rPr>
+                <w:rFonts w:ascii="Arial" w:hAnsi="Arial" w:cs="Arial"/>
+              </w:rPr>
+              <w:t>}</w:t>
             </w:r>
           </w:p>
         </w:tc>

</xml_diff>

<commit_message>
Report and code fixed
</commit_message>
<xml_diff>
--- a/electron/database/generate-document/templates/contract-review.docx
+++ b/electron/database/generate-document/templates/contract-review.docx
@@ -440,7 +440,7 @@
                 <w:sz w:val="20"/>
                 <w:szCs w:val="20"/>
               </w:rPr>
-              <w:t>shippingDetails</w:t>
+              <w:t>deliveryAt</w:t>
             </w:r>
             <w:proofErr w:type="spellEnd"/>
             <w:r>
@@ -1061,15 +1061,7 @@
                 <w:sz w:val="20"/>
                 <w:szCs w:val="20"/>
               </w:rPr>
-              <w:t xml:space="preserve"> </w:t>
-            </w:r>
-            <w:r>
-              <w:rPr>
-                <w:rFonts w:ascii="Arial" w:hAnsi="Arial" w:cs="Arial"/>
-                <w:sz w:val="20"/>
-                <w:szCs w:val="20"/>
-              </w:rPr>
-              <w:t>By</w:t>
+              <w:t xml:space="preserve"> By</w:t>
             </w:r>
             <w:r>
               <w:rPr>
@@ -1187,17 +1179,6 @@
           </w:tcPr>
           <w:p>
             <w:pPr>
-              <w:jc w:val="center"/>
-              <w:rPr>
-                <w:rFonts w:ascii="Arial" w:hAnsi="Arial" w:cs="Arial"/>
-                <w:sz w:val="20"/>
-                <w:szCs w:val="20"/>
-              </w:rPr>
-            </w:pPr>
-          </w:p>
-          <w:p>
-            <w:pPr>
-              <w:jc w:val="center"/>
               <w:rPr>
                 <w:rFonts w:ascii="Arial" w:hAnsi="Arial" w:cs="Arial"/>
                 <w:sz w:val="20"/>
@@ -1228,10 +1209,36 @@
               <w:jc w:val="center"/>
               <w:rPr>
                 <w:rFonts w:ascii="Arial" w:hAnsi="Arial" w:cs="Arial"/>
-                <w:sz w:val="20"/>
-                <w:szCs w:val="20"/>
-              </w:rPr>
-            </w:pPr>
+                <w:sz w:val="18"/>
+                <w:szCs w:val="18"/>
+              </w:rPr>
+            </w:pPr>
+            <w:r>
+              <w:rPr>
+                <w:rFonts w:ascii="Arial" w:hAnsi="Arial" w:cs="Arial"/>
+                <w:sz w:val="18"/>
+                <w:szCs w:val="18"/>
+              </w:rPr>
+              <w:t>{</w:t>
+            </w:r>
+            <w:proofErr w:type="spellStart"/>
+            <w:r>
+              <w:rPr>
+                <w:rFonts w:ascii="Arial" w:hAnsi="Arial" w:cs="Arial"/>
+                <w:sz w:val="18"/>
+                <w:szCs w:val="18"/>
+              </w:rPr>
+              <w:t>crFirstIns</w:t>
+            </w:r>
+            <w:proofErr w:type="spellEnd"/>
+            <w:r>
+              <w:rPr>
+                <w:rFonts w:ascii="Arial" w:hAnsi="Arial" w:cs="Arial"/>
+                <w:sz w:val="18"/>
+                <w:szCs w:val="18"/>
+              </w:rPr>
+              <w:t>}</w:t>
+            </w:r>
           </w:p>
           <w:p>
             <w:pPr>

</xml_diff>

<commit_message>
Add easy to open crate in 3 static user NU, Laminex, Panel
</commit_message>
<xml_diff>
--- a/electron/database/generate-document/templates/contract-review.docx
+++ b/electron/database/generate-document/templates/contract-review.docx
@@ -47,8 +47,18 @@
                 <w:sz w:val="20"/>
                 <w:szCs w:val="20"/>
               </w:rPr>
-              <w:t>CUSTOMER / ADDRESS :</w:t>
-            </w:r>
+              <w:t xml:space="preserve">CUSTOMER / </w:t>
+            </w:r>
+            <w:proofErr w:type="gramStart"/>
+            <w:r>
+              <w:rPr>
+                <w:rFonts w:ascii="Arial" w:hAnsi="Arial" w:cs="Arial"/>
+                <w:sz w:val="20"/>
+                <w:szCs w:val="20"/>
+              </w:rPr>
+              <w:t>ADDRESS :</w:t>
+            </w:r>
+            <w:proofErr w:type="gramEnd"/>
           </w:p>
           <w:p>
             <w:pPr>
@@ -69,24 +79,60 @@
                 <w:sz w:val="20"/>
                 <w:szCs w:val="20"/>
               </w:rPr>
-              <w:t>{consigneeName}</w:t>
-            </w:r>
-          </w:p>
-          <w:p>
-            <w:pPr>
-              <w:rPr>
-                <w:rFonts w:ascii="Arial" w:hAnsi="Arial" w:cs="Arial"/>
-                <w:sz w:val="20"/>
-                <w:szCs w:val="20"/>
-              </w:rPr>
-            </w:pPr>
-            <w:r>
-              <w:rPr>
-                <w:rFonts w:ascii="Arial" w:hAnsi="Arial" w:cs="Arial"/>
-                <w:sz w:val="20"/>
-                <w:szCs w:val="20"/>
-              </w:rPr>
-              <w:t>{consigneeCountry}</w:t>
+              <w:t>{</w:t>
+            </w:r>
+            <w:proofErr w:type="spellStart"/>
+            <w:r>
+              <w:rPr>
+                <w:rFonts w:ascii="Arial" w:hAnsi="Arial" w:cs="Arial"/>
+                <w:sz w:val="20"/>
+                <w:szCs w:val="20"/>
+              </w:rPr>
+              <w:t>consigneeName</w:t>
+            </w:r>
+            <w:proofErr w:type="spellEnd"/>
+            <w:r>
+              <w:rPr>
+                <w:rFonts w:ascii="Arial" w:hAnsi="Arial" w:cs="Arial"/>
+                <w:sz w:val="20"/>
+                <w:szCs w:val="20"/>
+              </w:rPr>
+              <w:t>}</w:t>
+            </w:r>
+          </w:p>
+          <w:p>
+            <w:pPr>
+              <w:rPr>
+                <w:rFonts w:ascii="Arial" w:hAnsi="Arial" w:cs="Arial"/>
+                <w:sz w:val="20"/>
+                <w:szCs w:val="20"/>
+              </w:rPr>
+            </w:pPr>
+            <w:r>
+              <w:rPr>
+                <w:rFonts w:ascii="Arial" w:hAnsi="Arial" w:cs="Arial"/>
+                <w:sz w:val="20"/>
+                <w:szCs w:val="20"/>
+              </w:rPr>
+              <w:t>{</w:t>
+            </w:r>
+            <w:proofErr w:type="spellStart"/>
+            <w:r>
+              <w:rPr>
+                <w:rFonts w:ascii="Arial" w:hAnsi="Arial" w:cs="Arial"/>
+                <w:sz w:val="20"/>
+                <w:szCs w:val="20"/>
+              </w:rPr>
+              <w:t>consigneeCountry</w:t>
+            </w:r>
+            <w:proofErr w:type="spellEnd"/>
+            <w:r>
+              <w:rPr>
+                <w:rFonts w:ascii="Arial" w:hAnsi="Arial" w:cs="Arial"/>
+                <w:sz w:val="20"/>
+                <w:szCs w:val="20"/>
+              </w:rPr>
+              <w:t>}</w:t>
             </w:r>
           </w:p>
         </w:tc>
@@ -103,13 +149,23 @@
                 <w:szCs w:val="20"/>
               </w:rPr>
             </w:pPr>
-            <w:r>
-              <w:rPr>
-                <w:rFonts w:ascii="Arial" w:hAnsi="Arial" w:cs="Arial"/>
-                <w:sz w:val="20"/>
-                <w:szCs w:val="20"/>
-              </w:rPr>
-              <w:t xml:space="preserve">DATE : </w:t>
+            <w:proofErr w:type="gramStart"/>
+            <w:r>
+              <w:rPr>
+                <w:rFonts w:ascii="Arial" w:hAnsi="Arial" w:cs="Arial"/>
+                <w:sz w:val="20"/>
+                <w:szCs w:val="20"/>
+              </w:rPr>
+              <w:t>DATE :</w:t>
+            </w:r>
+            <w:proofErr w:type="gramEnd"/>
+            <w:r>
+              <w:rPr>
+                <w:rFonts w:ascii="Arial" w:hAnsi="Arial" w:cs="Arial"/>
+                <w:sz w:val="20"/>
+                <w:szCs w:val="20"/>
+              </w:rPr>
+              <w:t xml:space="preserve"> </w:t>
             </w:r>
             <w:r>
               <w:rPr>
@@ -119,6 +175,7 @@
               </w:rPr>
               <w:t>{</w:t>
             </w:r>
+            <w:proofErr w:type="spellStart"/>
             <w:r>
               <w:rPr>
                 <w:rFonts w:cstheme="minorHAnsi"/>
@@ -128,6 +185,7 @@
               </w:rPr>
               <w:t>orderDate</w:t>
             </w:r>
+            <w:proofErr w:type="spellEnd"/>
             <w:r>
               <w:rPr>
                 <w:rFonts w:ascii="Arial" w:hAnsi="Arial" w:cs="Arial"/>
@@ -163,7 +221,16 @@
                 <w:sz w:val="20"/>
                 <w:szCs w:val="20"/>
               </w:rPr>
-              <w:t>OPF. NO.</w:t>
+              <w:t xml:space="preserve">OPF. </w:t>
+            </w:r>
+            <w:proofErr w:type="gramStart"/>
+            <w:r>
+              <w:rPr>
+                <w:rFonts w:ascii="Arial" w:hAnsi="Arial" w:cs="Arial"/>
+                <w:sz w:val="20"/>
+                <w:szCs w:val="20"/>
+              </w:rPr>
+              <w:t>NO.</w:t>
             </w:r>
             <w:r>
               <w:rPr>
@@ -173,6 +240,7 @@
               </w:rPr>
               <w:t xml:space="preserve"> :</w:t>
             </w:r>
+            <w:proofErr w:type="gramEnd"/>
             <w:r>
               <w:rPr>
                 <w:rFonts w:ascii="Arial" w:hAnsi="Arial" w:cs="Arial"/>
@@ -190,7 +258,31 @@
                 <w:sz w:val="20"/>
                 <w:szCs w:val="20"/>
               </w:rPr>
-              <w:t>{invoicePiNo}</w:t>
+              <w:t>{</w:t>
+            </w:r>
+            <w:proofErr w:type="spellStart"/>
+            <w:r>
+              <w:rPr>
+                <w:rFonts w:ascii="Arial" w:hAnsi="Arial" w:cs="Arial"/>
+                <w:bCs/>
+                <w:spacing w:val="-2"/>
+                <w:position w:val="2"/>
+                <w:sz w:val="20"/>
+                <w:szCs w:val="20"/>
+              </w:rPr>
+              <w:t>invoicePiNo</w:t>
+            </w:r>
+            <w:proofErr w:type="spellEnd"/>
+            <w:r>
+              <w:rPr>
+                <w:rFonts w:ascii="Arial" w:hAnsi="Arial" w:cs="Arial"/>
+                <w:bCs/>
+                <w:spacing w:val="-2"/>
+                <w:position w:val="2"/>
+                <w:sz w:val="20"/>
+                <w:szCs w:val="20"/>
+              </w:rPr>
+              <w:t>}</w:t>
             </w:r>
           </w:p>
         </w:tc>
@@ -231,7 +323,25 @@
                 <w:sz w:val="20"/>
                 <w:szCs w:val="20"/>
               </w:rPr>
-              <w:t xml:space="preserve">PO REF : </w:t>
+              <w:t xml:space="preserve">PO </w:t>
+            </w:r>
+            <w:proofErr w:type="gramStart"/>
+            <w:r>
+              <w:rPr>
+                <w:rFonts w:ascii="Arial" w:hAnsi="Arial" w:cs="Arial"/>
+                <w:sz w:val="20"/>
+                <w:szCs w:val="20"/>
+              </w:rPr>
+              <w:t>REF :</w:t>
+            </w:r>
+            <w:proofErr w:type="gramEnd"/>
+            <w:r>
+              <w:rPr>
+                <w:rFonts w:ascii="Arial" w:hAnsi="Arial" w:cs="Arial"/>
+                <w:sz w:val="20"/>
+                <w:szCs w:val="20"/>
+              </w:rPr>
+              <w:t xml:space="preserve"> </w:t>
             </w:r>
             <w:r>
               <w:rPr>
@@ -280,15 +390,51 @@
                 <w:sz w:val="20"/>
                 <w:szCs w:val="20"/>
               </w:rPr>
-              <w:t xml:space="preserve">DELIVERY DATE : </w:t>
-            </w:r>
-            <w:r>
-              <w:rPr>
-                <w:rFonts w:ascii="Arial" w:hAnsi="Arial" w:cs="Arial"/>
-                <w:sz w:val="20"/>
-                <w:szCs w:val="20"/>
-              </w:rPr>
-              <w:t>{deliveryDetails}</w:t>
+              <w:t xml:space="preserve">DELIVERY </w:t>
+            </w:r>
+            <w:proofErr w:type="gramStart"/>
+            <w:r>
+              <w:rPr>
+                <w:rFonts w:ascii="Arial" w:hAnsi="Arial" w:cs="Arial"/>
+                <w:sz w:val="20"/>
+                <w:szCs w:val="20"/>
+              </w:rPr>
+              <w:t>DATE :</w:t>
+            </w:r>
+            <w:proofErr w:type="gramEnd"/>
+            <w:r>
+              <w:rPr>
+                <w:rFonts w:ascii="Arial" w:hAnsi="Arial" w:cs="Arial"/>
+                <w:sz w:val="20"/>
+                <w:szCs w:val="20"/>
+              </w:rPr>
+              <w:t xml:space="preserve"> </w:t>
+            </w:r>
+            <w:r>
+              <w:rPr>
+                <w:rFonts w:ascii="Arial" w:hAnsi="Arial" w:cs="Arial"/>
+                <w:sz w:val="20"/>
+                <w:szCs w:val="20"/>
+              </w:rPr>
+              <w:t>{</w:t>
+            </w:r>
+            <w:proofErr w:type="spellStart"/>
+            <w:r>
+              <w:rPr>
+                <w:rFonts w:ascii="Arial" w:hAnsi="Arial" w:cs="Arial"/>
+                <w:sz w:val="20"/>
+                <w:szCs w:val="20"/>
+              </w:rPr>
+              <w:t>deliveryDetails</w:t>
+            </w:r>
+            <w:proofErr w:type="spellEnd"/>
+            <w:r>
+              <w:rPr>
+                <w:rFonts w:ascii="Arial" w:hAnsi="Arial" w:cs="Arial"/>
+                <w:sz w:val="20"/>
+                <w:szCs w:val="20"/>
+              </w:rPr>
+              <w:t>}</w:t>
             </w:r>
           </w:p>
         </w:tc>
@@ -313,7 +459,25 @@
                 <w:sz w:val="20"/>
                 <w:szCs w:val="20"/>
               </w:rPr>
-              <w:t xml:space="preserve">CST / ST No. : </w:t>
+              <w:t xml:space="preserve">CST / ST </w:t>
+            </w:r>
+            <w:proofErr w:type="gramStart"/>
+            <w:r>
+              <w:rPr>
+                <w:rFonts w:ascii="Arial" w:hAnsi="Arial" w:cs="Arial"/>
+                <w:sz w:val="20"/>
+                <w:szCs w:val="20"/>
+              </w:rPr>
+              <w:t>No. :</w:t>
+            </w:r>
+            <w:proofErr w:type="gramEnd"/>
+            <w:r>
+              <w:rPr>
+                <w:rFonts w:ascii="Arial" w:hAnsi="Arial" w:cs="Arial"/>
+                <w:sz w:val="20"/>
+                <w:szCs w:val="20"/>
+              </w:rPr>
+              <w:t xml:space="preserve"> </w:t>
             </w:r>
             <w:r>
               <w:rPr>
@@ -344,7 +508,25 @@
                 <w:sz w:val="20"/>
                 <w:szCs w:val="20"/>
               </w:rPr>
-              <w:t xml:space="preserve">DELIVERY AT : </w:t>
+              <w:t xml:space="preserve">DELIVERY </w:t>
+            </w:r>
+            <w:proofErr w:type="gramStart"/>
+            <w:r>
+              <w:rPr>
+                <w:rFonts w:ascii="Arial" w:hAnsi="Arial" w:cs="Arial"/>
+                <w:sz w:val="20"/>
+                <w:szCs w:val="20"/>
+              </w:rPr>
+              <w:t>AT :</w:t>
+            </w:r>
+            <w:proofErr w:type="gramEnd"/>
+            <w:r>
+              <w:rPr>
+                <w:rFonts w:ascii="Arial" w:hAnsi="Arial" w:cs="Arial"/>
+                <w:sz w:val="20"/>
+                <w:szCs w:val="20"/>
+              </w:rPr>
+              <w:t xml:space="preserve"> </w:t>
             </w:r>
             <w:r>
               <w:rPr>
@@ -354,6 +536,7 @@
               </w:rPr>
               <w:t>{</w:t>
             </w:r>
+            <w:proofErr w:type="spellStart"/>
             <w:r>
               <w:rPr>
                 <w:rFonts w:ascii="Arial" w:hAnsi="Arial" w:cs="Arial"/>
@@ -362,6 +545,7 @@
               </w:rPr>
               <w:t>deliveryAt</w:t>
             </w:r>
+            <w:proofErr w:type="spellEnd"/>
             <w:r>
               <w:rPr>
                 <w:rFonts w:ascii="Arial" w:hAnsi="Arial" w:cs="Arial"/>
@@ -393,8 +577,18 @@
                 <w:sz w:val="20"/>
                 <w:szCs w:val="20"/>
               </w:rPr>
-              <w:t>TOTAL REQUIREMENT SUMMARY – DETAILS AS PER OPF (TOTAL OPF Attachments-     )</w:t>
-            </w:r>
+              <w:t xml:space="preserve">TOTAL REQUIREMENT SUMMARY – DETAILS AS PER OPF (TOTAL OPF Attachments-   </w:t>
+            </w:r>
+            <w:proofErr w:type="gramStart"/>
+            <w:r>
+              <w:rPr>
+                <w:rFonts w:ascii="Arial" w:hAnsi="Arial" w:cs="Arial"/>
+                <w:sz w:val="20"/>
+                <w:szCs w:val="20"/>
+              </w:rPr>
+              <w:t xml:space="preserve">  )</w:t>
+            </w:r>
+            <w:proofErr w:type="gramEnd"/>
           </w:p>
         </w:tc>
       </w:tr>
@@ -942,6 +1136,7 @@
                 <w:szCs w:val="20"/>
               </w:rPr>
             </w:pPr>
+            <w:proofErr w:type="gramStart"/>
             <w:r>
               <w:rPr>
                 <w:rFonts w:ascii="Arial" w:hAnsi="Arial" w:cs="Arial"/>
@@ -956,7 +1151,16 @@
                 <w:sz w:val="20"/>
                 <w:szCs w:val="20"/>
               </w:rPr>
-              <w:t xml:space="preserve"> : {</w:t>
+              <w:t xml:space="preserve"> :</w:t>
+            </w:r>
+            <w:proofErr w:type="gramEnd"/>
+            <w:r>
+              <w:rPr>
+                <w:rFonts w:ascii="Arial" w:hAnsi="Arial" w:cs="Arial"/>
+                <w:sz w:val="20"/>
+                <w:szCs w:val="20"/>
+              </w:rPr>
+              <w:t xml:space="preserve"> {</w:t>
             </w:r>
             <w:r>
               <w:rPr>
@@ -990,6 +1194,7 @@
               </w:rPr>
               <w:t xml:space="preserve"> {</w:t>
             </w:r>
+            <w:proofErr w:type="spellStart"/>
             <w:r>
               <w:rPr>
                 <w:rFonts w:ascii="Arial" w:hAnsi="Arial" w:cs="Arial"/>
@@ -998,6 +1203,7 @@
               </w:rPr>
               <w:t>transportationMode</w:t>
             </w:r>
+            <w:proofErr w:type="spellEnd"/>
             <w:r>
               <w:rPr>
                 <w:rFonts w:ascii="Arial" w:hAnsi="Arial" w:cs="Arial"/>
@@ -1006,6 +1212,7 @@
               </w:rPr>
               <w:t>}{/</w:t>
             </w:r>
+            <w:proofErr w:type="spellStart"/>
             <w:r>
               <w:rPr>
                 <w:rFonts w:ascii="Arial" w:hAnsi="Arial" w:cs="Arial"/>
@@ -1014,6 +1221,7 @@
               </w:rPr>
               <w:t>transportationMode</w:t>
             </w:r>
+            <w:proofErr w:type="spellEnd"/>
             <w:r>
               <w:rPr>
                 <w:rFonts w:ascii="Arial" w:hAnsi="Arial" w:cs="Arial"/>
@@ -1094,12 +1302,139 @@
           </w:tcPr>
           <w:p>
             <w:pPr>
-              <w:rPr>
-                <w:rFonts w:ascii="Arial" w:hAnsi="Arial" w:cs="Arial"/>
-                <w:sz w:val="20"/>
-                <w:szCs w:val="20"/>
-              </w:rPr>
-            </w:pPr>
+              <w:jc w:val="center"/>
+              <w:rPr>
+                <w:rFonts w:cstheme="minorHAnsi"/>
+                <w:b/>
+                <w:bCs/>
+                <w:sz w:val="20"/>
+                <w:szCs w:val="20"/>
+              </w:rPr>
+            </w:pPr>
+            <w:r>
+              <w:rPr>
+                <w:rFonts w:cstheme="minorHAnsi"/>
+                <w:b/>
+                <w:bCs/>
+                <w:sz w:val="20"/>
+                <w:szCs w:val="20"/>
+              </w:rPr>
+              <w:t>{#</w:t>
+            </w:r>
+            <w:r>
+              <w:rPr>
+                <w:rFonts w:cstheme="minorHAnsi"/>
+                <w:b/>
+                <w:bCs/>
+                <w:sz w:val="20"/>
+                <w:szCs w:val="20"/>
+              </w:rPr>
+              <w:t>isEasyToOpenCrate</w:t>
+            </w:r>
+            <w:r>
+              <w:rPr>
+                <w:rFonts w:cstheme="minorHAnsi"/>
+                <w:b/>
+                <w:bCs/>
+                <w:sz w:val="20"/>
+                <w:szCs w:val="20"/>
+              </w:rPr>
+              <w:t>}</w:t>
+            </w:r>
+            <w:r>
+              <w:rPr>
+                <w:rFonts w:cstheme="minorHAnsi"/>
+                <w:b/>
+                <w:bCs/>
+                <w:sz w:val="20"/>
+                <w:szCs w:val="20"/>
+              </w:rPr>
+              <w:t xml:space="preserve"> </w:t>
+            </w:r>
+            <w:r>
+              <w:rPr>
+                <w:rFonts w:cstheme="minorHAnsi"/>
+                <w:b/>
+                <w:bCs/>
+                <w:sz w:val="20"/>
+                <w:szCs w:val="20"/>
+              </w:rPr>
+              <w:t>EASY TO OPEN CRATE</w:t>
+            </w:r>
+            <w:r>
+              <w:rPr>
+                <w:rFonts w:cstheme="minorHAnsi"/>
+                <w:b/>
+                <w:bCs/>
+                <w:sz w:val="20"/>
+                <w:szCs w:val="20"/>
+              </w:rPr>
+              <w:t xml:space="preserve"> </w:t>
+            </w:r>
+          </w:p>
+          <w:p>
+            <w:pPr>
+              <w:jc w:val="center"/>
+              <w:rPr>
+                <w:rFonts w:cstheme="minorHAnsi"/>
+                <w:b/>
+                <w:bCs/>
+                <w:sz w:val="20"/>
+                <w:szCs w:val="20"/>
+              </w:rPr>
+            </w:pPr>
+            <w:r>
+              <w:rPr>
+                <w:rFonts w:cstheme="minorHAnsi"/>
+                <w:b/>
+                <w:bCs/>
+                <w:sz w:val="20"/>
+                <w:szCs w:val="20"/>
+              </w:rPr>
+              <w:t>{</w:t>
+            </w:r>
+            <w:r>
+              <w:rPr>
+                <w:rFonts w:cstheme="minorHAnsi"/>
+                <w:b/>
+                <w:bCs/>
+                <w:sz w:val="20"/>
+                <w:szCs w:val="20"/>
+              </w:rPr>
+              <w:t>/</w:t>
+            </w:r>
+            <w:proofErr w:type="spellStart"/>
+            <w:r>
+              <w:rPr>
+                <w:rFonts w:cstheme="minorHAnsi"/>
+                <w:b/>
+                <w:bCs/>
+                <w:sz w:val="20"/>
+                <w:szCs w:val="20"/>
+              </w:rPr>
+              <w:t>isEasyToOpenCrate</w:t>
+            </w:r>
+            <w:proofErr w:type="spellEnd"/>
+            <w:r>
+              <w:rPr>
+                <w:rFonts w:cstheme="minorHAnsi"/>
+                <w:b/>
+                <w:bCs/>
+                <w:sz w:val="20"/>
+                <w:szCs w:val="20"/>
+              </w:rPr>
+              <w:t>}</w:t>
+            </w:r>
+            <w:r>
+              <w:rPr>
+                <w:rFonts w:cstheme="minorHAnsi"/>
+                <w:b/>
+                <w:bCs/>
+                <w:sz w:val="20"/>
+                <w:szCs w:val="20"/>
+              </w:rPr>
+              <w:t xml:space="preserve">  </w:t>
+            </w:r>
           </w:p>
           <w:p>
             <w:pPr>
@@ -1136,6 +1471,7 @@
               </w:rPr>
               <w:t>{</w:t>
             </w:r>
+            <w:proofErr w:type="spellStart"/>
             <w:r>
               <w:rPr>
                 <w:rFonts w:ascii="Arial" w:hAnsi="Arial" w:cs="Arial"/>
@@ -1144,6 +1480,7 @@
               </w:rPr>
               <w:t>specialInstruction</w:t>
             </w:r>
+            <w:proofErr w:type="spellEnd"/>
             <w:r>
               <w:rPr>
                 <w:rFonts w:ascii="Arial" w:hAnsi="Arial" w:cs="Arial"/>
@@ -1279,13 +1616,23 @@
                 <w:szCs w:val="20"/>
               </w:rPr>
             </w:pPr>
-            <w:r>
-              <w:rPr>
-                <w:rFonts w:ascii="Arial" w:hAnsi="Arial" w:cs="Arial"/>
-                <w:sz w:val="20"/>
-                <w:szCs w:val="20"/>
-              </w:rPr>
-              <w:t xml:space="preserve">FOLDERS : </w:t>
+            <w:proofErr w:type="gramStart"/>
+            <w:r>
+              <w:rPr>
+                <w:rFonts w:ascii="Arial" w:hAnsi="Arial" w:cs="Arial"/>
+                <w:sz w:val="20"/>
+                <w:szCs w:val="20"/>
+              </w:rPr>
+              <w:t>FOLDERS :</w:t>
+            </w:r>
+            <w:proofErr w:type="gramEnd"/>
+            <w:r>
+              <w:rPr>
+                <w:rFonts w:ascii="Arial" w:hAnsi="Arial" w:cs="Arial"/>
+                <w:sz w:val="20"/>
+                <w:szCs w:val="20"/>
+              </w:rPr>
+              <w:t xml:space="preserve"> </w:t>
             </w:r>
           </w:p>
         </w:tc>
@@ -1308,7 +1655,25 @@
                 <w:sz w:val="20"/>
                 <w:szCs w:val="20"/>
               </w:rPr>
-              <w:t xml:space="preserve">CUT SHEETS : </w:t>
+              <w:t xml:space="preserve">CUT </w:t>
+            </w:r>
+            <w:proofErr w:type="gramStart"/>
+            <w:r>
+              <w:rPr>
+                <w:rFonts w:ascii="Arial" w:hAnsi="Arial" w:cs="Arial"/>
+                <w:sz w:val="20"/>
+                <w:szCs w:val="20"/>
+              </w:rPr>
+              <w:t>SHEETS :</w:t>
+            </w:r>
+            <w:proofErr w:type="gramEnd"/>
+            <w:r>
+              <w:rPr>
+                <w:rFonts w:ascii="Arial" w:hAnsi="Arial" w:cs="Arial"/>
+                <w:sz w:val="20"/>
+                <w:szCs w:val="20"/>
+              </w:rPr>
+              <w:t xml:space="preserve"> </w:t>
             </w:r>
           </w:p>
         </w:tc>
@@ -1325,13 +1690,23 @@
                 <w:szCs w:val="20"/>
               </w:rPr>
             </w:pPr>
-            <w:r>
-              <w:rPr>
-                <w:rFonts w:ascii="Arial" w:hAnsi="Arial" w:cs="Arial"/>
-                <w:sz w:val="20"/>
-                <w:szCs w:val="20"/>
-              </w:rPr>
-              <w:t xml:space="preserve">CHAINS : </w:t>
+            <w:proofErr w:type="gramStart"/>
+            <w:r>
+              <w:rPr>
+                <w:rFonts w:ascii="Arial" w:hAnsi="Arial" w:cs="Arial"/>
+                <w:sz w:val="20"/>
+                <w:szCs w:val="20"/>
+              </w:rPr>
+              <w:t>CHAINS :</w:t>
+            </w:r>
+            <w:proofErr w:type="gramEnd"/>
+            <w:r>
+              <w:rPr>
+                <w:rFonts w:ascii="Arial" w:hAnsi="Arial" w:cs="Arial"/>
+                <w:sz w:val="20"/>
+                <w:szCs w:val="20"/>
+              </w:rPr>
+              <w:t xml:space="preserve"> </w:t>
             </w:r>
           </w:p>
         </w:tc>
@@ -1980,8 +2355,36 @@
                 <w:sz w:val="24"/>
                 <w:szCs w:val="24"/>
               </w:rPr>
-              <w:t xml:space="preserve">Form No. 403FF001 (1)                                        (INCHARGE UNIT I/II) (SALES COORDINATOR)   </w:t>
-            </w:r>
+              <w:t xml:space="preserve">Form No. 403FF001 (1)                                     </w:t>
+            </w:r>
+            <w:proofErr w:type="gramStart"/>
+            <w:r>
+              <w:rPr>
+                <w:rFonts w:ascii="Arial" w:hAnsi="Arial" w:cs="Arial"/>
+                <w:sz w:val="24"/>
+                <w:szCs w:val="24"/>
+              </w:rPr>
+              <w:t xml:space="preserve">   (</w:t>
+            </w:r>
+            <w:proofErr w:type="gramEnd"/>
+            <w:r>
+              <w:rPr>
+                <w:rFonts w:ascii="Arial" w:hAnsi="Arial" w:cs="Arial"/>
+                <w:sz w:val="24"/>
+                <w:szCs w:val="24"/>
+              </w:rPr>
+              <w:t xml:space="preserve">INCHARGE UNIT I/II) (SALES </w:t>
+            </w:r>
+            <w:proofErr w:type="gramStart"/>
+            <w:r>
+              <w:rPr>
+                <w:rFonts w:ascii="Arial" w:hAnsi="Arial" w:cs="Arial"/>
+                <w:sz w:val="24"/>
+                <w:szCs w:val="24"/>
+              </w:rPr>
+              <w:t xml:space="preserve">COORDINATOR)   </w:t>
+            </w:r>
+            <w:proofErr w:type="gramEnd"/>
           </w:p>
         </w:tc>
       </w:tr>
@@ -2695,7 +3098,6 @@
   <w:style w:type="character" w:default="1" w:styleId="DefaultParagraphFont">
     <w:name w:val="Default Paragraph Font"/>
     <w:uiPriority w:val="1"/>
-    <w:semiHidden/>
     <w:unhideWhenUsed/>
   </w:style>
   <w:style w:type="table" w:default="1" w:styleId="TableNormal">

</xml_diff>